<commit_message>
Update analysis and thesis outline documents
</commit_message>
<xml_diff>
--- a/Source/Proposal/Thesis Outline.docx
+++ b/Source/Proposal/Thesis Outline.docx
@@ -16,14 +16,14 @@
     </w:p>
     <w:p>
       <w:pPr>
-        <w:pStyle w:val="2"/>
+        <w:pStyle w:val="1"/>
         <w:numPr>
-          <w:ilvl w:val="1"/>
+          <w:ilvl w:val="0"/>
           <w:numId w:val="1"/>
         </w:numPr>
       </w:pPr>
       <w:r>
-        <w:t>Motivation and Problem Statement</w:t>
+        <w:t>Baseline Agent: ARK-V1 and ARK-V1.1</w:t>
       </w:r>
     </w:p>
     <w:p>
@@ -35,7 +35,7 @@
         </w:numPr>
       </w:pPr>
       <w:r>
-        <w:t>Research Objectives</w:t>
+        <w:t>Architecture and Workflow of ARK-V1</w:t>
       </w:r>
     </w:p>
     <w:p>
@@ -47,7 +47,19 @@
         </w:numPr>
       </w:pPr>
       <w:r>
-        <w:t>Structure of the Thesis</w:t>
+        <w:t>Adaptation to GTSQA: ARK-V1.1</w:t>
+      </w:r>
+    </w:p>
+    <w:p>
+      <w:pPr>
+        <w:pStyle w:val="2"/>
+        <w:numPr>
+          <w:ilvl w:val="1"/>
+          <w:numId w:val="1"/>
+        </w:numPr>
+      </w:pPr>
+      <w:r>
+        <w:t>Baseline Definition</w:t>
       </w:r>
     </w:p>
     <w:p>
@@ -59,7 +71,7 @@
         </w:numPr>
       </w:pPr>
       <w:r>
-        <w:t>Background and Related Work</w:t>
+        <w:t>Evaluation Framework</w:t>
       </w:r>
     </w:p>
     <w:p>
@@ -71,7 +83,7 @@
         </w:numPr>
       </w:pPr>
       <w:r>
-        <w:t>Knowledge Graphs and Knowledge Graph Question Answering</w:t>
+        <w:t>From Agent Capabilities to Metrics</w:t>
       </w:r>
     </w:p>
     <w:p>
@@ -83,7 +95,7 @@
         </w:numPr>
       </w:pPr>
       <w:r>
-        <w:t>Large Language Model-Based Agents</w:t>
+        <w:t>Evaluation Datasets and Data Split</w:t>
       </w:r>
     </w:p>
     <w:p>
@@ -95,7 +107,7 @@
         </w:numPr>
       </w:pPr>
       <w:r>
-        <w:t>Multi-Hop Reasoning</w:t>
+        <w:t>Construction and Validation of GTSQA-UA</w:t>
       </w:r>
     </w:p>
     <w:p>
@@ -107,7 +119,7 @@
         </w:numPr>
       </w:pPr>
       <w:r>
-        <w:t>Agent Frameworks and Tool Use</w:t>
+        <w:t>Metrics and Analysis Dimensions</w:t>
       </w:r>
     </w:p>
     <w:p>
@@ -119,7 +131,7 @@
         </w:numPr>
       </w:pPr>
       <w:r>
-        <w:t>Evaluation Approaches and Existing Datasets</w:t>
+        <w:t>Output Contract and Evaluation Pipeline</w:t>
       </w:r>
     </w:p>
     <w:p>
@@ -131,7 +143,7 @@
         </w:numPr>
       </w:pPr>
       <w:r>
-        <w:t>Analysis of the Existing Knowledge Graph Agent</w:t>
+        <w:t>Baseline Evaluation and Failure Analysis</w:t>
       </w:r>
     </w:p>
     <w:p>
@@ -143,7 +155,7 @@
         </w:numPr>
       </w:pPr>
       <w:r>
-        <w:t>Architecture and Workflow</w:t>
+        <w:t>Preliminary Results</w:t>
       </w:r>
     </w:p>
     <w:p>
@@ -155,7 +167,7 @@
         </w:numPr>
       </w:pPr>
       <w:r>
-        <w:t>Reasoning and Tool-Use Process</w:t>
+        <w:t>Failure Taxonomy</w:t>
       </w:r>
     </w:p>
     <w:p>
@@ -167,7 +179,19 @@
         </w:numPr>
       </w:pPr>
       <w:r>
-        <w:t>Knowledge Graph Querying</w:t>
+        <w:t>Derived Requirements for ARK-V2</w:t>
+      </w:r>
+    </w:p>
+    <w:p>
+      <w:pPr>
+        <w:pStyle w:val="1"/>
+        <w:numPr>
+          <w:ilvl w:val="0"/>
+          <w:numId w:val="1"/>
+        </w:numPr>
+      </w:pPr>
+      <w:r>
+        <w:t>Design and Implementation of ARK-V2</w:t>
       </w:r>
     </w:p>
     <w:p>
@@ -179,7 +203,55 @@
         </w:numPr>
       </w:pPr>
       <w:r>
-        <w:t>Identified Limitations and Improvement Opportunities</w:t>
+        <w:t>Design Overview</w:t>
+      </w:r>
+    </w:p>
+    <w:p>
+      <w:pPr>
+        <w:pStyle w:val="2"/>
+        <w:numPr>
+          <w:ilvl w:val="1"/>
+          <w:numId w:val="1"/>
+        </w:numPr>
+      </w:pPr>
+      <w:r>
+        <w:t>Question Analysis and Constraint Representation</w:t>
+      </w:r>
+    </w:p>
+    <w:p>
+      <w:pPr>
+        <w:pStyle w:val="2"/>
+        <w:numPr>
+          <w:ilvl w:val="1"/>
+          <w:numId w:val="1"/>
+        </w:numPr>
+      </w:pPr>
+      <w:r>
+        <w:t>Exploration State and Evidence Retention</w:t>
+      </w:r>
+    </w:p>
+    <w:p>
+      <w:pPr>
+        <w:pStyle w:val="2"/>
+        <w:numPr>
+          <w:ilvl w:val="1"/>
+          <w:numId w:val="1"/>
+        </w:numPr>
+      </w:pPr>
+      <w:r>
+        <w:t>Answer Verification, Knowledge-Use Policy and Answer Binding</w:t>
+      </w:r>
+    </w:p>
+    <w:p>
+      <w:pPr>
+        <w:pStyle w:val="2"/>
+        <w:numPr>
+          <w:ilvl w:val="1"/>
+          <w:numId w:val="1"/>
+        </w:numPr>
+      </w:pPr>
+      <w:r>
+        <w:t>Implementation</w:t>
       </w:r>
     </w:p>
     <w:p>
@@ -191,7 +263,7 @@
         </w:numPr>
       </w:pPr>
       <w:r>
-        <w:t>Design and Implementation of the Improved Agent</w:t>
+        <w:t>Evaluation and Discussion</w:t>
       </w:r>
     </w:p>
     <w:p>
@@ -203,7 +275,7 @@
         </w:numPr>
       </w:pPr>
       <w:r>
-        <w:t>Requirements and Design Decisions</w:t>
+        <w:t>Experimental Protocol</w:t>
       </w:r>
     </w:p>
     <w:p>
@@ -215,7 +287,7 @@
         </w:numPr>
       </w:pPr>
       <w:r>
-        <w:t>Improved Reasoning Workflow</w:t>
+        <w:t>Answer Correctness</w:t>
       </w:r>
     </w:p>
     <w:p>
@@ -227,7 +299,7 @@
         </w:numPr>
       </w:pPr>
       <w:r>
-        <w:t>Tool Integration and Graph Querying</w:t>
+        <w:t>Graph Evidence</w:t>
       </w:r>
     </w:p>
     <w:p>
@@ -239,7 +311,7 @@
         </w:numPr>
       </w:pPr>
       <w:r>
-        <w:t>Answer Generation</w:t>
+        <w:t>Answerability and Refusal</w:t>
       </w:r>
     </w:p>
     <w:p>
@@ -251,19 +323,7 @@
         </w:numPr>
       </w:pPr>
       <w:r>
-        <w:t>Implementation Using LangGraph</w:t>
-      </w:r>
-    </w:p>
-    <w:p>
-      <w:pPr>
-        <w:pStyle w:val="1"/>
-        <w:numPr>
-          <w:ilvl w:val="0"/>
-          <w:numId w:val="1"/>
-        </w:numPr>
-      </w:pPr>
-      <w:r>
-        <w:t>Experimental Design</w:t>
+        <w:t>Cost and Efficiency</w:t>
       </w:r>
     </w:p>
     <w:p>
@@ -275,7 +335,7 @@
         </w:numPr>
       </w:pPr>
       <w:r>
-        <w:t>Research Questions and Evaluation Approach</w:t>
+        <w:t>Failure Case Analysis</w:t>
       </w:r>
     </w:p>
     <w:p>
@@ -287,7 +347,7 @@
         </w:numPr>
       </w:pPr>
       <w:r>
-        <w:t>Evaluation Data</w:t>
+        <w:t>Discussion</w:t>
       </w:r>
     </w:p>
     <w:p>
@@ -299,92 +359,7 @@
         </w:numPr>
       </w:pPr>
       <w:r>
-        <w:t>Compared Agent Versions</w:t>
-      </w:r>
-    </w:p>
-    <w:p>
-      <w:pPr>
-        <w:pStyle w:val="2"/>
-        <w:numPr>
-          <w:ilvl w:val="1"/>
-          <w:numId w:val="1"/>
-        </w:numPr>
-      </w:pPr>
-      <w:r>
-        <w:t>Optional RAG Baseline</w:t>
-      </w:r>
-    </w:p>
-    <w:p>
-      <w:pPr>
-        <w:pStyle w:val="2"/>
-        <w:numPr>
-          <w:ilvl w:val="1"/>
-          <w:numId w:val="1"/>
-        </w:numPr>
-      </w:pPr>
-      <w:r>
-        <w:t>Experimental Setup</w:t>
-      </w:r>
-    </w:p>
-    <w:p>
-      <w:pPr>
-        <w:pStyle w:val="1"/>
-        <w:numPr>
-          <w:ilvl w:val="0"/>
-          <w:numId w:val="1"/>
-        </w:numPr>
-      </w:pPr>
-      <w:r>
-        <w:t>Results and Discussion</w:t>
-      </w:r>
-    </w:p>
-    <w:p>
-      <w:pPr>
-        <w:pStyle w:val="2"/>
-        <w:numPr>
-          <w:ilvl w:val="1"/>
-          <w:numId w:val="1"/>
-        </w:numPr>
-      </w:pPr>
-      <w:r>
-        <w:t>Quantitative Results</w:t>
-      </w:r>
-    </w:p>
-    <w:p>
-      <w:pPr>
-        <w:pStyle w:val="2"/>
-        <w:numPr>
-          <w:ilvl w:val="1"/>
-          <w:numId w:val="1"/>
-        </w:numPr>
-      </w:pPr>
-      <w:r>
-        <w:t>Comparison with the Existing Prototype</w:t>
-      </w:r>
-    </w:p>
-    <w:p>
-      <w:pPr>
-        <w:pStyle w:val="2"/>
-        <w:numPr>
-          <w:ilvl w:val="1"/>
-          <w:numId w:val="1"/>
-        </w:numPr>
-      </w:pPr>
-      <w:r>
-        <w:t>Discussion of Knowledge Graph Utilization</w:t>
-      </w:r>
-    </w:p>
-    <w:p>
-      <w:pPr>
-        <w:pStyle w:val="2"/>
-        <w:numPr>
-          <w:ilvl w:val="1"/>
-          <w:numId w:val="1"/>
-        </w:numPr>
-      </w:pPr>
-      <w:r>
-        <w:lastRenderedPageBreak/>
-        <w:t>Limitations</w:t>
+        <w:t>Limitations and Threats to Validity</w:t>
       </w:r>
     </w:p>
     <w:p>
@@ -397,6 +372,54 @@
       </w:pPr>
       <w:r>
         <w:t>Conclusion and Outlook</w:t>
+      </w:r>
+    </w:p>
+    <w:p>
+      <w:pPr>
+        <w:pStyle w:val="2"/>
+        <w:numPr>
+          <w:ilvl w:val="1"/>
+          <w:numId w:val="1"/>
+        </w:numPr>
+      </w:pPr>
+      <w:r>
+        <w:t>Summary and Answers to the Research Questions</w:t>
+      </w:r>
+    </w:p>
+    <w:p>
+      <w:pPr>
+        <w:pStyle w:val="2"/>
+        <w:numPr>
+          <w:ilvl w:val="1"/>
+          <w:numId w:val="1"/>
+        </w:numPr>
+      </w:pPr>
+      <w:r>
+        <w:t>Contributions</w:t>
+      </w:r>
+    </w:p>
+    <w:p>
+      <w:pPr>
+        <w:pStyle w:val="2"/>
+        <w:numPr>
+          <w:ilvl w:val="1"/>
+          <w:numId w:val="1"/>
+        </w:numPr>
+      </w:pPr>
+      <w:r>
+        <w:t>Outlook</w:t>
+      </w:r>
+    </w:p>
+    <w:p>
+      <w:pPr>
+        <w:pStyle w:val="1"/>
+        <w:numPr>
+          <w:ilvl w:val="0"/>
+          <w:numId w:val="0"/>
+        </w:numPr>
+      </w:pPr>
+      <w:r>
+        <w:t>Appendix</w:t>
       </w:r>
     </w:p>
     <w:sectPr>

</xml_diff>